<commit_message>
Updating the word doc and pdf of the written responses.
</commit_message>
<xml_diff>
--- a/Assignment_2_Group_1/COSC4353_SoftwareDesign_Assignment_2_Group_1.docx
+++ b/Assignment_2_Group_1/COSC4353_SoftwareDesign_Assignment_2_Group_1.docx
@@ -31,7 +31,13 @@
         <w:jc w:val="left"/>
       </w:pPr>
       <w:r>
-        <w:t>GitHub Repository Link:</w:t>
+        <w:t>GitHub Repository Link</w:t>
+      </w:r>
+      <w:r>
+        <w:t>s</w:t>
+      </w:r>
+      <w:r>
+        <w:t>:</w:t>
       </w:r>
       <w:r>
         <w:t xml:space="preserve"> </w:t>
@@ -39,14 +45,47 @@
     </w:p>
     <w:p>
       <w:pPr>
-        <w:jc w:val="left"/>
-      </w:pPr>
-    </w:p>
-    <w:p>
-      <w:pPr>
-        <w:jc w:val="left"/>
-      </w:pPr>
-      <w:hyperlink r:id="rId5" w:history="1">
+        <w:pStyle w:val="ListParagraph"/>
+        <w:numPr>
+          <w:ilvl w:val="0"/>
+          <w:numId w:val="3"/>
+        </w:numPr>
+        <w:jc w:val="left"/>
+      </w:pPr>
+      <w:r>
+        <w:t>Direct</w:t>
+      </w:r>
+      <w:r>
+        <w:t>ly</w:t>
+      </w:r>
+      <w:r>
+        <w:t xml:space="preserve"> to the repository: </w:t>
+      </w:r>
+      <w:hyperlink r:id="rId8" w:history="1">
+        <w:r>
+          <w:rPr>
+            <w:rStyle w:val="Hyperlink"/>
+          </w:rPr>
+          <w:t>https://github.com/Antiquely3031/COSC4353_SoftwareDesignGroup1_Summer2026</w:t>
+        </w:r>
+      </w:hyperlink>
+      <w:r>
+        <w:t xml:space="preserve"> </w:t>
+      </w:r>
+    </w:p>
+    <w:p>
+      <w:pPr>
+        <w:pStyle w:val="ListParagraph"/>
+        <w:numPr>
+          <w:ilvl w:val="0"/>
+          <w:numId w:val="3"/>
+        </w:numPr>
+        <w:jc w:val="left"/>
+      </w:pPr>
+      <w:r>
+        <w:t xml:space="preserve">Directly to the folder holding Assignment 2 related files: </w:t>
+      </w:r>
+      <w:hyperlink r:id="rId9" w:history="1">
         <w:r>
           <w:rPr>
             <w:rStyle w:val="Hyperlink"/>
@@ -585,7 +624,6 @@
         <w:jc w:val="left"/>
       </w:pPr>
       <w:r>
-        <w:lastRenderedPageBreak/>
         <w:t>Front-End Technologies and Responsibilities:</w:t>
       </w:r>
     </w:p>
@@ -685,7 +723,7 @@
         <w:pStyle w:val="ListParagraph"/>
         <w:numPr>
           <w:ilvl w:val="0"/>
-          <w:numId w:val="3"/>
+          <w:numId w:val="5"/>
         </w:numPr>
         <w:jc w:val="left"/>
       </w:pPr>
@@ -714,7 +752,13 @@
           <wp:inline distT="0" distB="0" distL="0" distR="0" wp14:anchorId="1A500661" wp14:editId="572E7156">
             <wp:extent cx="2091700" cy="3657600"/>
             <wp:effectExtent l="0" t="0" r="3810" b="0"/>
-            <wp:docPr id="1144892498" name="Picture 1" descr="The image displays a user interface with a blue background, featuring a welcome message, a login button, and sections for signing up and creating an account.&#10;&#10;AI-generated content may be incorrect."/>
+            <wp:docPr id="1144892498" name="Picture 1" descr="The image displays a user interface with a blue background, featuring a welcome message, a login button, and sections for signing up and creating an account.&#10;&#10;AI-generated content may be incorrect.">
+              <a:extLst xmlns:a="http://schemas.openxmlformats.org/drawingml/2006/main">
+                <a:ext uri="{FF2B5EF4-FFF2-40B4-BE49-F238E27FC236}">
+                  <a16:creationId xmlns:a16="http://schemas.microsoft.com/office/drawing/2014/main" id="{0EAE11AD-9D58-4612-863A-C2D9C83AC79A}"/>
+                </a:ext>
+              </a:extLst>
+            </wp:docPr>
             <wp:cNvGraphicFramePr>
               <a:graphicFrameLocks xmlns:a="http://schemas.openxmlformats.org/drawingml/2006/main" noChangeAspect="1"/>
             </wp:cNvGraphicFramePr>
@@ -726,7 +770,7 @@
                     <pic:cNvPicPr/>
                   </pic:nvPicPr>
                   <pic:blipFill>
-                    <a:blip r:embed="rId6">
+                    <a:blip r:embed="rId10">
                       <a:extLst>
                         <a:ext uri="{28A0092B-C50C-407E-A947-70E740481C1C}">
                           <a14:useLocalDpi xmlns:a14="http://schemas.microsoft.com/office/drawing/2010/main" val="0"/>
@@ -763,7 +807,13 @@
           <wp:inline distT="0" distB="0" distL="0" distR="0" wp14:anchorId="35FB42C4" wp14:editId="561AAACD">
             <wp:extent cx="1620733" cy="3657600"/>
             <wp:effectExtent l="0" t="0" r="0" b="0"/>
-            <wp:docPr id="1390871741" name="Picture 2" descr="The image displays a user interface for account creation, including fields for personal details, email, and password, with a prompt to create an account or log in.&#10;&#10;AI-generated content may be incorrect."/>
+            <wp:docPr id="1390871741" name="Picture 2" descr="The image displays a user interface for account creation, including fields for personal details, email, and password, with a prompt to create an account or log in.&#10;&#10;AI-generated content may be incorrect.">
+              <a:extLst xmlns:a="http://schemas.openxmlformats.org/drawingml/2006/main">
+                <a:ext uri="{FF2B5EF4-FFF2-40B4-BE49-F238E27FC236}">
+                  <a16:creationId xmlns:a16="http://schemas.microsoft.com/office/drawing/2014/main" id="{696E2172-1A99-4038-B02C-6EF46D2261DD}"/>
+                </a:ext>
+              </a:extLst>
+            </wp:docPr>
             <wp:cNvGraphicFramePr>
               <a:graphicFrameLocks xmlns:a="http://schemas.openxmlformats.org/drawingml/2006/main" noChangeAspect="1"/>
             </wp:cNvGraphicFramePr>
@@ -775,7 +825,7 @@
                     <pic:cNvPicPr/>
                   </pic:nvPicPr>
                   <pic:blipFill>
-                    <a:blip r:embed="rId7">
+                    <a:blip r:embed="rId11">
                       <a:extLst>
                         <a:ext uri="{28A0092B-C50C-407E-A947-70E740481C1C}">
                           <a14:useLocalDpi xmlns:a14="http://schemas.microsoft.com/office/drawing/2010/main" val="0"/>
@@ -812,7 +862,13 @@
           <wp:inline distT="0" distB="0" distL="0" distR="0" wp14:anchorId="5AC16A49" wp14:editId="720F59BB">
             <wp:extent cx="2511188" cy="3657600"/>
             <wp:effectExtent l="0" t="0" r="3810" b="0"/>
-            <wp:docPr id="1095252613" name="Picture 3" descr="The image displays a QUEUESMART login page for administrators, featuring fields for admin email, admin password, and a login button.&#10;&#10;AI-generated content may be incorrect."/>
+            <wp:docPr id="1095252613" name="Picture 3" descr="The image displays a QUEUESMART login page for administrators, featuring fields for admin email, admin password, and a login button.&#10;&#10;AI-generated content may be incorrect.">
+              <a:extLst xmlns:a="http://schemas.openxmlformats.org/drawingml/2006/main">
+                <a:ext uri="{FF2B5EF4-FFF2-40B4-BE49-F238E27FC236}">
+                  <a16:creationId xmlns:a16="http://schemas.microsoft.com/office/drawing/2014/main" id="{9D11D708-89D0-40D3-ABAD-A2FD0A6DEA91}"/>
+                </a:ext>
+              </a:extLst>
+            </wp:docPr>
             <wp:cNvGraphicFramePr>
               <a:graphicFrameLocks xmlns:a="http://schemas.openxmlformats.org/drawingml/2006/main" noChangeAspect="1"/>
             </wp:cNvGraphicFramePr>
@@ -824,7 +880,7 @@
                     <pic:cNvPicPr/>
                   </pic:nvPicPr>
                   <pic:blipFill>
-                    <a:blip r:embed="rId8">
+                    <a:blip r:embed="rId12">
                       <a:extLst>
                         <a:ext uri="{28A0092B-C50C-407E-A947-70E740481C1C}">
                           <a14:useLocalDpi xmlns:a14="http://schemas.microsoft.com/office/drawing/2010/main" val="0"/>
@@ -865,7 +921,7 @@
         <w:pStyle w:val="ListParagraph"/>
         <w:numPr>
           <w:ilvl w:val="0"/>
-          <w:numId w:val="3"/>
+          <w:numId w:val="5"/>
         </w:numPr>
         <w:jc w:val="left"/>
       </w:pPr>
@@ -888,10 +944,32 @@
           <w:noProof/>
         </w:rPr>
         <w:drawing>
-          <wp:inline distT="0" distB="0" distL="0" distR="0" wp14:anchorId="5B032120" wp14:editId="5FA9498F">
-            <wp:extent cx="6858000" cy="3392170"/>
+          <wp:anchor distT="0" distB="0" distL="114300" distR="114300" simplePos="0" relativeHeight="251658240" behindDoc="0" locked="0" layoutInCell="1" allowOverlap="1" wp14:anchorId="5B032120" wp14:editId="63A8E4E8">
+            <wp:simplePos x="0" y="0"/>
+            <wp:positionH relativeFrom="margin">
+              <wp:align>center</wp:align>
+            </wp:positionH>
+            <wp:positionV relativeFrom="paragraph">
+              <wp:posOffset>8890</wp:posOffset>
+            </wp:positionV>
+            <wp:extent cx="6057900" cy="2995930"/>
             <wp:effectExtent l="0" t="0" r="0" b="0"/>
-            <wp:docPr id="87755386" name="Picture 7" descr="A user interface for QueueSmart, displaying a user's current queue status, available services, and notifications.&#10;&#10;AI-generated content may be incorrect."/>
+            <wp:wrapThrough wrapText="bothSides">
+              <wp:wrapPolygon edited="0">
+                <wp:start x="0" y="0"/>
+                <wp:lineTo x="0" y="21426"/>
+                <wp:lineTo x="21532" y="21426"/>
+                <wp:lineTo x="21532" y="0"/>
+                <wp:lineTo x="0" y="0"/>
+              </wp:wrapPolygon>
+            </wp:wrapThrough>
+            <wp:docPr id="1217943405" name="Picture 7" descr="A user interface for QueueSmart, displaying a user's current queue status, available services, and notifications.&#10;&#10;AI-generated content may be incorrect.">
+              <a:extLst xmlns:a="http://schemas.openxmlformats.org/drawingml/2006/main">
+                <a:ext uri="{FF2B5EF4-FFF2-40B4-BE49-F238E27FC236}">
+                  <a16:creationId xmlns:a16="http://schemas.microsoft.com/office/drawing/2014/main" id="{174800F9-8E11-4427-8C96-C9FDDB2A7723}"/>
+                </a:ext>
+              </a:extLst>
+            </wp:docPr>
             <wp:cNvGraphicFramePr>
               <a:graphicFrameLocks xmlns:a="http://schemas.openxmlformats.org/drawingml/2006/main" noChangeAspect="1"/>
             </wp:cNvGraphicFramePr>
@@ -899,11 +977,11 @@
               <a:graphicData uri="http://schemas.openxmlformats.org/drawingml/2006/picture">
                 <pic:pic xmlns:pic="http://schemas.openxmlformats.org/drawingml/2006/picture">
                   <pic:nvPicPr>
-                    <pic:cNvPr id="87755386" name="Picture 7" descr="A user interface for QueueSmart, displaying a user's current queue status, available services, and notifications.&#10;&#10;AI-generated content may be incorrect."/>
+                    <pic:cNvPr id="1217943405" name="Picture 7" descr="A user interface for QueueSmart, displaying a user's current queue status, available services, and notifications.&#10;&#10;AI-generated content may be incorrect."/>
                     <pic:cNvPicPr/>
                   </pic:nvPicPr>
                   <pic:blipFill>
-                    <a:blip r:embed="rId9" cstate="print">
+                    <a:blip r:embed="rId13" cstate="print">
                       <a:extLst>
                         <a:ext uri="{28A0092B-C50C-407E-A947-70E740481C1C}">
                           <a14:useLocalDpi xmlns:a14="http://schemas.microsoft.com/office/drawing/2010/main" val="0"/>
@@ -917,7 +995,7 @@
                   <pic:spPr>
                     <a:xfrm>
                       <a:off x="0" y="0"/>
-                      <a:ext cx="6858000" cy="3392170"/>
+                      <a:ext cx="6057900" cy="2995930"/>
                     </a:xfrm>
                     <a:prstGeom prst="rect">
                       <a:avLst/>
@@ -926,7 +1004,13 @@
                 </pic:pic>
               </a:graphicData>
             </a:graphic>
-          </wp:inline>
+            <wp14:sizeRelH relativeFrom="margin">
+              <wp14:pctWidth>0</wp14:pctWidth>
+            </wp14:sizeRelH>
+            <wp14:sizeRelV relativeFrom="margin">
+              <wp14:pctHeight>0</wp14:pctHeight>
+            </wp14:sizeRelV>
+          </wp:anchor>
         </w:drawing>
       </w:r>
     </w:p>
@@ -940,11 +1024,12 @@
         <w:pStyle w:val="ListParagraph"/>
         <w:numPr>
           <w:ilvl w:val="0"/>
-          <w:numId w:val="3"/>
+          <w:numId w:val="5"/>
         </w:numPr>
         <w:jc w:val="left"/>
       </w:pPr>
       <w:r>
+        <w:lastRenderedPageBreak/>
         <w:t>Join Queue</w:t>
       </w:r>
     </w:p>
@@ -963,10 +1048,16 @@
           <w:noProof/>
         </w:rPr>
         <w:drawing>
-          <wp:inline distT="0" distB="0" distL="0" distR="0" wp14:anchorId="45067942" wp14:editId="0A43A1F7">
+          <wp:inline distT="0" distB="0" distL="0" distR="0" wp14:anchorId="45067942" wp14:editId="62FECA6F">
             <wp:extent cx="6858000" cy="2744470"/>
             <wp:effectExtent l="0" t="0" r="0" b="0"/>
-            <wp:docPr id="1265895665" name="Picture 8" descr="QueueSmart&#10;&#10;AI-generated content may be incorrect."/>
+            <wp:docPr id="1265895665" name="Picture 8" descr="QueueSmart&#10;&#10;AI-generated content may be incorrect.">
+              <a:extLst xmlns:a="http://schemas.openxmlformats.org/drawingml/2006/main">
+                <a:ext uri="{FF2B5EF4-FFF2-40B4-BE49-F238E27FC236}">
+                  <a16:creationId xmlns:a16="http://schemas.microsoft.com/office/drawing/2014/main" id="{DBF01B28-50BE-4474-BFC0-9FEB99B1064F}"/>
+                </a:ext>
+              </a:extLst>
+            </wp:docPr>
             <wp:cNvGraphicFramePr>
               <a:graphicFrameLocks xmlns:a="http://schemas.openxmlformats.org/drawingml/2006/main" noChangeAspect="1"/>
             </wp:cNvGraphicFramePr>
@@ -978,7 +1069,7 @@
                     <pic:cNvPicPr/>
                   </pic:nvPicPr>
                   <pic:blipFill>
-                    <a:blip r:embed="rId10" cstate="print">
+                    <a:blip r:embed="rId14" cstate="print">
                       <a:extLst>
                         <a:ext uri="{28A0092B-C50C-407E-A947-70E740481C1C}">
                           <a14:useLocalDpi xmlns:a14="http://schemas.microsoft.com/office/drawing/2010/main" val="0"/>
@@ -1007,45 +1098,54 @@
     </w:p>
     <w:p>
       <w:pPr>
+        <w:pStyle w:val="ListParagraph"/>
+        <w:jc w:val="left"/>
+      </w:pPr>
+    </w:p>
+    <w:p>
+      <w:pPr>
+        <w:pStyle w:val="ListParagraph"/>
+        <w:numPr>
+          <w:ilvl w:val="0"/>
+          <w:numId w:val="5"/>
+        </w:numPr>
+        <w:jc w:val="left"/>
+      </w:pPr>
+      <w:r>
+        <w:t>Admin Dashboard</w:t>
+      </w:r>
+    </w:p>
+    <w:p>
+      <w:pPr>
         <w:jc w:val="left"/>
         <w:rPr>
           <w:sz w:val="14"/>
           <w:szCs w:val="14"/>
         </w:rPr>
       </w:pPr>
-    </w:p>
-    <w:p>
-      <w:pPr>
-        <w:pStyle w:val="ListParagraph"/>
-        <w:numPr>
-          <w:ilvl w:val="0"/>
-          <w:numId w:val="3"/>
-        </w:numPr>
-        <w:jc w:val="left"/>
-      </w:pPr>
-      <w:r>
-        <w:t>Admin Dashboard</w:t>
-      </w:r>
-    </w:p>
-    <w:p>
-      <w:pPr>
-        <w:jc w:val="left"/>
-        <w:rPr>
-          <w:sz w:val="14"/>
-          <w:szCs w:val="14"/>
-        </w:rPr>
-      </w:pPr>
-    </w:p>
-    <w:p>
       <w:r>
         <w:rPr>
           <w:noProof/>
         </w:rPr>
         <w:drawing>
-          <wp:inline distT="0" distB="0" distL="0" distR="0" wp14:anchorId="33DB1B4D" wp14:editId="48FC1878">
-            <wp:extent cx="6858000" cy="3540760"/>
-            <wp:effectExtent l="0" t="0" r="0" b="2540"/>
-            <wp:docPr id="1353561316" name="Picture 4" descr="The image displays a dashboard interface with a services list, a queue length indicator, and various action buttons for managing services.&#10;&#10;AI-generated content may be incorrect."/>
+          <wp:anchor distT="0" distB="0" distL="114300" distR="114300" simplePos="0" relativeHeight="251659264" behindDoc="0" locked="0" layoutInCell="1" allowOverlap="1" wp14:anchorId="3A0E00BB" wp14:editId="20B6D9BF">
+            <wp:simplePos x="0" y="0"/>
+            <wp:positionH relativeFrom="margin">
+              <wp:posOffset>1150620</wp:posOffset>
+            </wp:positionH>
+            <wp:positionV relativeFrom="paragraph">
+              <wp:posOffset>36195</wp:posOffset>
+            </wp:positionV>
+            <wp:extent cx="4556760" cy="5730240"/>
+            <wp:effectExtent l="0" t="0" r="0" b="3810"/>
+            <wp:wrapNone/>
+            <wp:docPr id="1628035419" name="Picture 1628035419">
+              <a:extLst xmlns:a="http://schemas.openxmlformats.org/drawingml/2006/main">
+                <a:ext uri="{FF2B5EF4-FFF2-40B4-BE49-F238E27FC236}">
+                  <a16:creationId xmlns:a16="http://schemas.microsoft.com/office/drawing/2014/main" id="{C16C1CCC-1B0C-4804-B75F-F26EF13B9B81}"/>
+                </a:ext>
+              </a:extLst>
+            </wp:docPr>
             <wp:cNvGraphicFramePr>
               <a:graphicFrameLocks xmlns:a="http://schemas.openxmlformats.org/drawingml/2006/main" noChangeAspect="1"/>
             </wp:cNvGraphicFramePr>
@@ -1053,11 +1153,11 @@
               <a:graphicData uri="http://schemas.openxmlformats.org/drawingml/2006/picture">
                 <pic:pic xmlns:pic="http://schemas.openxmlformats.org/drawingml/2006/picture">
                   <pic:nvPicPr>
-                    <pic:cNvPr id="1353561316" name="Picture 4" descr="The image displays a dashboard interface with a services list, a queue length indicator, and various action buttons for managing services.&#10;&#10;AI-generated content may be incorrect."/>
+                    <pic:cNvPr id="1628035419" name=""/>
                     <pic:cNvPicPr/>
                   </pic:nvPicPr>
                   <pic:blipFill>
-                    <a:blip r:embed="rId11" cstate="print">
+                    <a:blip r:embed="rId15" cstate="print">
                       <a:extLst>
                         <a:ext uri="{28A0092B-C50C-407E-A947-70E740481C1C}">
                           <a14:useLocalDpi xmlns:a14="http://schemas.microsoft.com/office/drawing/2010/main" val="0"/>
@@ -1071,7 +1171,7 @@
                   <pic:spPr>
                     <a:xfrm>
                       <a:off x="0" y="0"/>
-                      <a:ext cx="6858000" cy="3540760"/>
+                      <a:ext cx="4556760" cy="5730240"/>
                     </a:xfrm>
                     <a:prstGeom prst="rect">
                       <a:avLst/>
@@ -1080,9 +1180,121 @@
                 </pic:pic>
               </a:graphicData>
             </a:graphic>
-          </wp:inline>
+            <wp14:sizeRelH relativeFrom="margin">
+              <wp14:pctWidth>0</wp14:pctWidth>
+            </wp14:sizeRelH>
+            <wp14:sizeRelV relativeFrom="margin">
+              <wp14:pctHeight>0</wp14:pctHeight>
+            </wp14:sizeRelV>
+          </wp:anchor>
         </w:drawing>
       </w:r>
+    </w:p>
+    <w:p/>
+    <w:p>
+      <w:pPr>
+        <w:jc w:val="left"/>
+      </w:pPr>
+    </w:p>
+    <w:p>
+      <w:pPr>
+        <w:jc w:val="left"/>
+      </w:pPr>
+    </w:p>
+    <w:p>
+      <w:pPr>
+        <w:jc w:val="left"/>
+      </w:pPr>
+    </w:p>
+    <w:p>
+      <w:pPr>
+        <w:jc w:val="left"/>
+      </w:pPr>
+    </w:p>
+    <w:p>
+      <w:pPr>
+        <w:jc w:val="left"/>
+      </w:pPr>
+    </w:p>
+    <w:p>
+      <w:pPr>
+        <w:jc w:val="left"/>
+      </w:pPr>
+    </w:p>
+    <w:p>
+      <w:pPr>
+        <w:jc w:val="left"/>
+      </w:pPr>
+    </w:p>
+    <w:p>
+      <w:pPr>
+        <w:jc w:val="left"/>
+      </w:pPr>
+    </w:p>
+    <w:p>
+      <w:pPr>
+        <w:jc w:val="left"/>
+      </w:pPr>
+    </w:p>
+    <w:p>
+      <w:pPr>
+        <w:jc w:val="left"/>
+      </w:pPr>
+    </w:p>
+    <w:p>
+      <w:pPr>
+        <w:jc w:val="left"/>
+      </w:pPr>
+    </w:p>
+    <w:p>
+      <w:pPr>
+        <w:jc w:val="left"/>
+      </w:pPr>
+    </w:p>
+    <w:p>
+      <w:pPr>
+        <w:jc w:val="left"/>
+      </w:pPr>
+    </w:p>
+    <w:p>
+      <w:pPr>
+        <w:jc w:val="left"/>
+      </w:pPr>
+    </w:p>
+    <w:p>
+      <w:pPr>
+        <w:jc w:val="left"/>
+      </w:pPr>
+    </w:p>
+    <w:p>
+      <w:pPr>
+        <w:jc w:val="left"/>
+      </w:pPr>
+    </w:p>
+    <w:p>
+      <w:pPr>
+        <w:jc w:val="left"/>
+      </w:pPr>
+    </w:p>
+    <w:p>
+      <w:pPr>
+        <w:jc w:val="left"/>
+      </w:pPr>
+    </w:p>
+    <w:p>
+      <w:pPr>
+        <w:jc w:val="left"/>
+      </w:pPr>
+    </w:p>
+    <w:p>
+      <w:pPr>
+        <w:jc w:val="left"/>
+      </w:pPr>
+    </w:p>
+    <w:p>
+      <w:pPr>
+        <w:jc w:val="left"/>
+      </w:pPr>
     </w:p>
     <w:p>
       <w:pPr>
@@ -1144,7 +1356,7 @@
         <w:pStyle w:val="ListParagraph"/>
         <w:numPr>
           <w:ilvl w:val="0"/>
-          <w:numId w:val="3"/>
+          <w:numId w:val="5"/>
         </w:numPr>
         <w:jc w:val="left"/>
       </w:pPr>
@@ -1162,16 +1374,39 @@
         </w:rPr>
       </w:pPr>
     </w:p>
-    <w:p>
-      <w:r>
+    <w:p/>
+    <w:p>
+      <w:pPr>
+        <w:jc w:val="left"/>
         <w:rPr>
-          <w:noProof/>
+          <w:sz w:val="14"/>
+          <w:szCs w:val="14"/>
+        </w:rPr>
+      </w:pPr>
+      <w:r>
+        <w:rPr>
+          <w:sz w:val="14"/>
+          <w:szCs w:val="14"/>
         </w:rPr>
         <w:drawing>
-          <wp:inline distT="0" distB="0" distL="0" distR="0" wp14:anchorId="507E2BB7" wp14:editId="5948629D">
-            <wp:extent cx="6858000" cy="2072640"/>
-            <wp:effectExtent l="0" t="0" r="0" b="3810"/>
-            <wp:docPr id="1283470355" name="Picture 5" descr="Placeholder 6.&#10;&#10;AI-generated content may be incorrect."/>
+          <wp:anchor distT="0" distB="0" distL="114300" distR="114300" simplePos="0" relativeHeight="251662336" behindDoc="0" locked="0" layoutInCell="1" allowOverlap="1" wp14:anchorId="5026493D" wp14:editId="41199AAD">
+            <wp:simplePos x="0" y="0"/>
+            <wp:positionH relativeFrom="margin">
+              <wp:align>right</wp:align>
+            </wp:positionH>
+            <wp:positionV relativeFrom="paragraph">
+              <wp:posOffset>8890</wp:posOffset>
+            </wp:positionV>
+            <wp:extent cx="3296920" cy="4037965"/>
+            <wp:effectExtent l="0" t="0" r="0" b="635"/>
+            <wp:wrapNone/>
+            <wp:docPr id="936445766" name="Picture 936445766">
+              <a:extLst xmlns:a="http://schemas.openxmlformats.org/drawingml/2006/main">
+                <a:ext uri="{FF2B5EF4-FFF2-40B4-BE49-F238E27FC236}">
+                  <a16:creationId xmlns:a16="http://schemas.microsoft.com/office/drawing/2014/main" id="{9318D773-F038-4E5C-BE54-61A13FC6C398}"/>
+                </a:ext>
+              </a:extLst>
+            </wp:docPr>
             <wp:cNvGraphicFramePr>
               <a:graphicFrameLocks xmlns:a="http://schemas.openxmlformats.org/drawingml/2006/main" noChangeAspect="1"/>
             </wp:cNvGraphicFramePr>
@@ -1179,11 +1414,11 @@
               <a:graphicData uri="http://schemas.openxmlformats.org/drawingml/2006/picture">
                 <pic:pic xmlns:pic="http://schemas.openxmlformats.org/drawingml/2006/picture">
                   <pic:nvPicPr>
-                    <pic:cNvPr id="1283470355" name="Picture 5" descr="Placeholder 6.&#10;&#10;AI-generated content may be incorrect."/>
+                    <pic:cNvPr id="936445766" name=""/>
                     <pic:cNvPicPr/>
                   </pic:nvPicPr>
                   <pic:blipFill>
-                    <a:blip r:embed="rId12" cstate="print">
+                    <a:blip r:embed="rId16">
                       <a:extLst>
                         <a:ext uri="{28A0092B-C50C-407E-A947-70E740481C1C}">
                           <a14:useLocalDpi xmlns:a14="http://schemas.microsoft.com/office/drawing/2010/main" val="0"/>
@@ -1197,7 +1432,57 @@
                   <pic:spPr>
                     <a:xfrm>
                       <a:off x="0" y="0"/>
-                      <a:ext cx="6858000" cy="2072640"/>
+                      <a:ext cx="3296920" cy="4037965"/>
+                    </a:xfrm>
+                    <a:prstGeom prst="rect">
+                      <a:avLst/>
+                    </a:prstGeom>
+                  </pic:spPr>
+                </pic:pic>
+              </a:graphicData>
+            </a:graphic>
+            <wp14:sizeRelH relativeFrom="margin">
+              <wp14:pctWidth>0</wp14:pctWidth>
+            </wp14:sizeRelH>
+          </wp:anchor>
+        </w:drawing>
+      </w:r>
+      <w:r>
+        <w:rPr>
+          <w:sz w:val="14"/>
+          <w:szCs w:val="14"/>
+        </w:rPr>
+        <w:drawing>
+          <wp:inline distT="0" distB="0" distL="0" distR="0" wp14:anchorId="49646990" wp14:editId="07979C05">
+            <wp:extent cx="3284220" cy="4045631"/>
+            <wp:effectExtent l="0" t="0" r="0" b="0"/>
+            <wp:docPr id="2090506969" name="Picture 3">
+              <a:extLst xmlns:a="http://schemas.openxmlformats.org/drawingml/2006/main">
+                <a:ext uri="{FF2B5EF4-FFF2-40B4-BE49-F238E27FC236}">
+                  <a16:creationId xmlns:a16="http://schemas.microsoft.com/office/drawing/2014/main" id="{34666763-2561-46C0-86E1-F1D2EECE0250}"/>
+                </a:ext>
+              </a:extLst>
+            </wp:docPr>
+            <wp:cNvGraphicFramePr>
+              <a:graphicFrameLocks xmlns:a="http://schemas.openxmlformats.org/drawingml/2006/main" noChangeAspect="1"/>
+            </wp:cNvGraphicFramePr>
+            <a:graphic xmlns:a="http://schemas.openxmlformats.org/drawingml/2006/main">
+              <a:graphicData uri="http://schemas.openxmlformats.org/drawingml/2006/picture">
+                <pic:pic xmlns:pic="http://schemas.openxmlformats.org/drawingml/2006/picture">
+                  <pic:nvPicPr>
+                    <pic:cNvPr id="2092720672" name=""/>
+                    <pic:cNvPicPr/>
+                  </pic:nvPicPr>
+                  <pic:blipFill>
+                    <a:blip r:embed="rId17"/>
+                    <a:stretch>
+                      <a:fillRect/>
+                    </a:stretch>
+                  </pic:blipFill>
+                  <pic:spPr>
+                    <a:xfrm>
+                      <a:off x="0" y="0"/>
+                      <a:ext cx="3285184" cy="4046818"/>
                     </a:xfrm>
                     <a:prstGeom prst="rect">
                       <a:avLst/>
@@ -1224,7 +1509,7 @@
         <w:pStyle w:val="ListParagraph"/>
         <w:numPr>
           <w:ilvl w:val="0"/>
-          <w:numId w:val="3"/>
+          <w:numId w:val="5"/>
         </w:numPr>
         <w:jc w:val="left"/>
       </w:pPr>
@@ -1240,17 +1525,26 @@
           <w:szCs w:val="14"/>
         </w:rPr>
       </w:pPr>
-    </w:p>
-    <w:p>
-      <w:r>
-        <w:rPr>
-          <w:noProof/>
-        </w:rPr>
+      <w:r>
         <w:drawing>
-          <wp:inline distT="0" distB="0" distL="0" distR="0" wp14:anchorId="30583345" wp14:editId="16A529FC">
-            <wp:extent cx="6858000" cy="2035810"/>
-            <wp:effectExtent l="0" t="0" r="0" b="2540"/>
-            <wp:docPr id="645479358" name="Picture 6" descr="The image displays a table with placeholder fields for services in a queue management system.&#10;&#10;AI-generated content may be incorrect."/>
+          <wp:anchor distT="0" distB="0" distL="114300" distR="114300" simplePos="0" relativeHeight="251660288" behindDoc="0" locked="0" layoutInCell="1" allowOverlap="1" wp14:anchorId="0926E069" wp14:editId="5BFC6771">
+            <wp:simplePos x="0" y="0"/>
+            <wp:positionH relativeFrom="margin">
+              <wp:posOffset>0</wp:posOffset>
+            </wp:positionH>
+            <wp:positionV relativeFrom="paragraph">
+              <wp:posOffset>6350</wp:posOffset>
+            </wp:positionV>
+            <wp:extent cx="3302000" cy="4452605"/>
+            <wp:effectExtent l="0" t="0" r="0" b="5715"/>
+            <wp:wrapNone/>
+            <wp:docPr id="1305977853" name="Picture 1305977853">
+              <a:extLst xmlns:a="http://schemas.openxmlformats.org/drawingml/2006/main">
+                <a:ext uri="{FF2B5EF4-FFF2-40B4-BE49-F238E27FC236}">
+                  <a16:creationId xmlns:a16="http://schemas.microsoft.com/office/drawing/2014/main" id="{7E38FAA4-F92E-4507-A419-67FD93371A8A}"/>
+                </a:ext>
+              </a:extLst>
+            </wp:docPr>
             <wp:cNvGraphicFramePr>
               <a:graphicFrameLocks xmlns:a="http://schemas.openxmlformats.org/drawingml/2006/main" noChangeAspect="1"/>
             </wp:cNvGraphicFramePr>
@@ -1258,11 +1552,11 @@
               <a:graphicData uri="http://schemas.openxmlformats.org/drawingml/2006/picture">
                 <pic:pic xmlns:pic="http://schemas.openxmlformats.org/drawingml/2006/picture">
                   <pic:nvPicPr>
-                    <pic:cNvPr id="645479358" name="Picture 6" descr="The image displays a table with placeholder fields for services in a queue management system.&#10;&#10;AI-generated content may be incorrect."/>
+                    <pic:cNvPr id="1305977853" name=""/>
                     <pic:cNvPicPr/>
                   </pic:nvPicPr>
                   <pic:blipFill>
-                    <a:blip r:embed="rId13" cstate="print">
+                    <a:blip r:embed="rId18">
                       <a:extLst>
                         <a:ext uri="{28A0092B-C50C-407E-A947-70E740481C1C}">
                           <a14:useLocalDpi xmlns:a14="http://schemas.microsoft.com/office/drawing/2010/main" val="0"/>
@@ -1276,7 +1570,7 @@
                   <pic:spPr>
                     <a:xfrm>
                       <a:off x="0" y="0"/>
-                      <a:ext cx="6858000" cy="2035810"/>
+                      <a:ext cx="3302000" cy="4452605"/>
                     </a:xfrm>
                     <a:prstGeom prst="rect">
                       <a:avLst/>
@@ -1285,10 +1579,78 @@
                 </pic:pic>
               </a:graphicData>
             </a:graphic>
-          </wp:inline>
+            <wp14:sizeRelV relativeFrom="margin">
+              <wp14:pctHeight>0</wp14:pctHeight>
+            </wp14:sizeRelV>
+          </wp:anchor>
         </w:drawing>
       </w:r>
-    </w:p>
+      <w:r>
+        <w:drawing>
+          <wp:anchor distT="0" distB="0" distL="114300" distR="114300" simplePos="0" relativeHeight="251661312" behindDoc="0" locked="0" layoutInCell="1" allowOverlap="1" wp14:anchorId="6DE8AF52" wp14:editId="36E1BF52">
+            <wp:simplePos x="0" y="0"/>
+            <wp:positionH relativeFrom="margin">
+              <wp:align>right</wp:align>
+            </wp:positionH>
+            <wp:positionV relativeFrom="paragraph">
+              <wp:posOffset>5716</wp:posOffset>
+            </wp:positionV>
+            <wp:extent cx="3327400" cy="4434840"/>
+            <wp:effectExtent l="0" t="0" r="6350" b="3810"/>
+            <wp:wrapNone/>
+            <wp:docPr id="439520182" name="Picture 439520182">
+              <a:extLst xmlns:a="http://schemas.openxmlformats.org/drawingml/2006/main">
+                <a:ext uri="{FF2B5EF4-FFF2-40B4-BE49-F238E27FC236}">
+                  <a16:creationId xmlns:a16="http://schemas.microsoft.com/office/drawing/2014/main" id="{A7D40AF9-BDC5-414C-A9A2-A79A462396B4}"/>
+                </a:ext>
+              </a:extLst>
+            </wp:docPr>
+            <wp:cNvGraphicFramePr>
+              <a:graphicFrameLocks xmlns:a="http://schemas.openxmlformats.org/drawingml/2006/main" noChangeAspect="1"/>
+            </wp:cNvGraphicFramePr>
+            <a:graphic xmlns:a="http://schemas.openxmlformats.org/drawingml/2006/main">
+              <a:graphicData uri="http://schemas.openxmlformats.org/drawingml/2006/picture">
+                <pic:pic xmlns:pic="http://schemas.openxmlformats.org/drawingml/2006/picture">
+                  <pic:nvPicPr>
+                    <pic:cNvPr id="439520182" name=""/>
+                    <pic:cNvPicPr/>
+                  </pic:nvPicPr>
+                  <pic:blipFill>
+                    <a:blip r:embed="rId19">
+                      <a:extLst>
+                        <a:ext uri="{28A0092B-C50C-407E-A947-70E740481C1C}">
+                          <a14:useLocalDpi xmlns:a14="http://schemas.microsoft.com/office/drawing/2010/main" val="0"/>
+                        </a:ext>
+                      </a:extLst>
+                    </a:blip>
+                    <a:stretch>
+                      <a:fillRect/>
+                    </a:stretch>
+                  </pic:blipFill>
+                  <pic:spPr>
+                    <a:xfrm>
+                      <a:off x="0" y="0"/>
+                      <a:ext cx="3327949" cy="4435572"/>
+                    </a:xfrm>
+                    <a:prstGeom prst="rect">
+                      <a:avLst/>
+                    </a:prstGeom>
+                  </pic:spPr>
+                </pic:pic>
+              </a:graphicData>
+            </a:graphic>
+            <wp14:sizeRelH relativeFrom="margin">
+              <wp14:pctWidth>0</wp14:pctWidth>
+            </wp14:sizeRelH>
+            <wp14:sizeRelV relativeFrom="margin">
+              <wp14:pctHeight>0</wp14:pctHeight>
+            </wp14:sizeRelV>
+          </wp:anchor>
+        </w:drawing>
+      </w:r>
+    </w:p>
+    <w:p/>
+    <w:p/>
     <w:p>
       <w:pPr>
         <w:rPr>
@@ -1299,14 +1661,146 @@
     </w:p>
     <w:p>
       <w:pPr>
+        <w:ind w:left="360"/>
+        <w:jc w:val="left"/>
+      </w:pPr>
+    </w:p>
+    <w:p>
+      <w:pPr>
+        <w:ind w:left="360"/>
+        <w:jc w:val="left"/>
+      </w:pPr>
+    </w:p>
+    <w:p>
+      <w:pPr>
+        <w:ind w:left="360"/>
+        <w:jc w:val="left"/>
+      </w:pPr>
+    </w:p>
+    <w:p>
+      <w:pPr>
+        <w:ind w:left="360"/>
+        <w:jc w:val="left"/>
+      </w:pPr>
+    </w:p>
+    <w:p>
+      <w:pPr>
+        <w:ind w:left="360"/>
+        <w:jc w:val="left"/>
+      </w:pPr>
+    </w:p>
+    <w:p>
+      <w:pPr>
+        <w:ind w:left="360"/>
+        <w:jc w:val="left"/>
+      </w:pPr>
+    </w:p>
+    <w:p>
+      <w:pPr>
+        <w:ind w:left="360"/>
+        <w:jc w:val="left"/>
+      </w:pPr>
+    </w:p>
+    <w:p>
+      <w:pPr>
+        <w:ind w:left="360"/>
+        <w:jc w:val="left"/>
+      </w:pPr>
+    </w:p>
+    <w:p>
+      <w:pPr>
+        <w:ind w:left="360"/>
+        <w:jc w:val="left"/>
+      </w:pPr>
+    </w:p>
+    <w:p>
+      <w:pPr>
+        <w:ind w:left="360"/>
+        <w:jc w:val="left"/>
+      </w:pPr>
+    </w:p>
+    <w:p>
+      <w:pPr>
+        <w:ind w:left="360"/>
+        <w:jc w:val="left"/>
+      </w:pPr>
+    </w:p>
+    <w:p>
+      <w:pPr>
+        <w:ind w:left="360"/>
+        <w:jc w:val="left"/>
+      </w:pPr>
+    </w:p>
+    <w:p>
+      <w:pPr>
+        <w:ind w:left="360"/>
+        <w:jc w:val="left"/>
+      </w:pPr>
+    </w:p>
+    <w:p>
+      <w:pPr>
+        <w:ind w:left="360"/>
+        <w:jc w:val="left"/>
+      </w:pPr>
+    </w:p>
+    <w:p>
+      <w:pPr>
+        <w:ind w:left="360"/>
+        <w:jc w:val="left"/>
+      </w:pPr>
+    </w:p>
+    <w:p>
+      <w:pPr>
+        <w:ind w:left="360"/>
+        <w:jc w:val="left"/>
+      </w:pPr>
+    </w:p>
+    <w:p>
+      <w:pPr>
+        <w:ind w:left="360"/>
+        <w:jc w:val="left"/>
+      </w:pPr>
+    </w:p>
+    <w:p>
+      <w:pPr>
+        <w:ind w:left="360"/>
+        <w:jc w:val="left"/>
+      </w:pPr>
+    </w:p>
+    <w:p>
+      <w:pPr>
+        <w:ind w:left="360"/>
+        <w:jc w:val="left"/>
+      </w:pPr>
+    </w:p>
+    <w:p>
+      <w:pPr>
+        <w:ind w:left="360"/>
+        <w:jc w:val="left"/>
+      </w:pPr>
+    </w:p>
+    <w:p>
+      <w:pPr>
+        <w:ind w:left="360"/>
+        <w:jc w:val="left"/>
+      </w:pPr>
+    </w:p>
+    <w:p>
+      <w:pPr>
+        <w:jc w:val="left"/>
+      </w:pPr>
+    </w:p>
+    <w:p>
+      <w:pPr>
         <w:pStyle w:val="ListParagraph"/>
         <w:numPr>
           <w:ilvl w:val="0"/>
-          <w:numId w:val="3"/>
+          <w:numId w:val="5"/>
         </w:numPr>
         <w:jc w:val="left"/>
       </w:pPr>
       <w:r>
+        <w:lastRenderedPageBreak/>
         <w:t>Notifications</w:t>
       </w:r>
     </w:p>
@@ -1325,10 +1819,16 @@
           <w:noProof/>
         </w:rPr>
         <w:drawing>
-          <wp:inline distT="0" distB="0" distL="0" distR="0" wp14:anchorId="15B84BF2" wp14:editId="70DE2E5A">
+          <wp:inline distT="0" distB="0" distL="0" distR="0" wp14:anchorId="15B84BF2" wp14:editId="4A70C33D">
             <wp:extent cx="6858000" cy="2814320"/>
             <wp:effectExtent l="0" t="0" r="0" b="5080"/>
-            <wp:docPr id="709645909" name="Picture 1"/>
+            <wp:docPr id="709645909" name="Picture 1">
+              <a:extLst xmlns:a="http://schemas.openxmlformats.org/drawingml/2006/main">
+                <a:ext uri="{FF2B5EF4-FFF2-40B4-BE49-F238E27FC236}">
+                  <a16:creationId xmlns:a16="http://schemas.microsoft.com/office/drawing/2014/main" id="{67090C16-E398-4E9D-A835-3EB7F35B3E26}"/>
+                </a:ext>
+              </a:extLst>
+            </wp:docPr>
             <wp:cNvGraphicFramePr>
               <a:graphicFrameLocks xmlns:a="http://schemas.openxmlformats.org/drawingml/2006/main" noChangeAspect="1"/>
             </wp:cNvGraphicFramePr>
@@ -1340,7 +1840,7 @@
                     <pic:cNvPicPr/>
                   </pic:nvPicPr>
                   <pic:blipFill>
-                    <a:blip r:embed="rId14" cstate="print">
+                    <a:blip r:embed="rId20" cstate="print">
                       <a:extLst>
                         <a:ext uri="{28A0092B-C50C-407E-A947-70E740481C1C}">
                           <a14:useLocalDpi xmlns:a14="http://schemas.microsoft.com/office/drawing/2010/main" val="0"/>
@@ -1493,6 +1993,119 @@
     </w:lvl>
   </w:abstractNum>
   <w:abstractNum w:abstractNumId="1" w15:restartNumberingAfterBreak="0">
+    <w:nsid w:val="4EA60916"/>
+    <w:multiLevelType w:val="hybridMultilevel"/>
+    <w:tmpl w:val="9ED4B722"/>
+    <w:lvl w:ilvl="0" w:tplc="04090001">
+      <w:start w:val="1"/>
+      <w:numFmt w:val="bullet"/>
+      <w:lvlText w:val=""/>
+      <w:lvlJc w:val="left"/>
+      <w:pPr>
+        <w:ind w:left="720" w:hanging="360"/>
+      </w:pPr>
+      <w:rPr>
+        <w:rFonts w:ascii="Symbol" w:hAnsi="Symbol" w:hint="default"/>
+      </w:rPr>
+    </w:lvl>
+    <w:lvl w:ilvl="1" w:tplc="04090003" w:tentative="1">
+      <w:start w:val="1"/>
+      <w:numFmt w:val="bullet"/>
+      <w:lvlText w:val="o"/>
+      <w:lvlJc w:val="left"/>
+      <w:pPr>
+        <w:ind w:left="1440" w:hanging="360"/>
+      </w:pPr>
+      <w:rPr>
+        <w:rFonts w:ascii="Courier New" w:hAnsi="Courier New" w:cs="Courier New" w:hint="default"/>
+      </w:rPr>
+    </w:lvl>
+    <w:lvl w:ilvl="2" w:tplc="04090005" w:tentative="1">
+      <w:start w:val="1"/>
+      <w:numFmt w:val="bullet"/>
+      <w:lvlText w:val=""/>
+      <w:lvlJc w:val="left"/>
+      <w:pPr>
+        <w:ind w:left="2160" w:hanging="360"/>
+      </w:pPr>
+      <w:rPr>
+        <w:rFonts w:ascii="Wingdings" w:hAnsi="Wingdings" w:hint="default"/>
+      </w:rPr>
+    </w:lvl>
+    <w:lvl w:ilvl="3" w:tplc="04090001" w:tentative="1">
+      <w:start w:val="1"/>
+      <w:numFmt w:val="bullet"/>
+      <w:lvlText w:val=""/>
+      <w:lvlJc w:val="left"/>
+      <w:pPr>
+        <w:ind w:left="2880" w:hanging="360"/>
+      </w:pPr>
+      <w:rPr>
+        <w:rFonts w:ascii="Symbol" w:hAnsi="Symbol" w:hint="default"/>
+      </w:rPr>
+    </w:lvl>
+    <w:lvl w:ilvl="4" w:tplc="04090003" w:tentative="1">
+      <w:start w:val="1"/>
+      <w:numFmt w:val="bullet"/>
+      <w:lvlText w:val="o"/>
+      <w:lvlJc w:val="left"/>
+      <w:pPr>
+        <w:ind w:left="3600" w:hanging="360"/>
+      </w:pPr>
+      <w:rPr>
+        <w:rFonts w:ascii="Courier New" w:hAnsi="Courier New" w:cs="Courier New" w:hint="default"/>
+      </w:rPr>
+    </w:lvl>
+    <w:lvl w:ilvl="5" w:tplc="04090005" w:tentative="1">
+      <w:start w:val="1"/>
+      <w:numFmt w:val="bullet"/>
+      <w:lvlText w:val=""/>
+      <w:lvlJc w:val="left"/>
+      <w:pPr>
+        <w:ind w:left="4320" w:hanging="360"/>
+      </w:pPr>
+      <w:rPr>
+        <w:rFonts w:ascii="Wingdings" w:hAnsi="Wingdings" w:hint="default"/>
+      </w:rPr>
+    </w:lvl>
+    <w:lvl w:ilvl="6" w:tplc="04090001" w:tentative="1">
+      <w:start w:val="1"/>
+      <w:numFmt w:val="bullet"/>
+      <w:lvlText w:val=""/>
+      <w:lvlJc w:val="left"/>
+      <w:pPr>
+        <w:ind w:left="5040" w:hanging="360"/>
+      </w:pPr>
+      <w:rPr>
+        <w:rFonts w:ascii="Symbol" w:hAnsi="Symbol" w:hint="default"/>
+      </w:rPr>
+    </w:lvl>
+    <w:lvl w:ilvl="7" w:tplc="04090003" w:tentative="1">
+      <w:start w:val="1"/>
+      <w:numFmt w:val="bullet"/>
+      <w:lvlText w:val="o"/>
+      <w:lvlJc w:val="left"/>
+      <w:pPr>
+        <w:ind w:left="5760" w:hanging="360"/>
+      </w:pPr>
+      <w:rPr>
+        <w:rFonts w:ascii="Courier New" w:hAnsi="Courier New" w:cs="Courier New" w:hint="default"/>
+      </w:rPr>
+    </w:lvl>
+    <w:lvl w:ilvl="8" w:tplc="04090005" w:tentative="1">
+      <w:start w:val="1"/>
+      <w:numFmt w:val="bullet"/>
+      <w:lvlText w:val=""/>
+      <w:lvlJc w:val="left"/>
+      <w:pPr>
+        <w:ind w:left="6480" w:hanging="360"/>
+      </w:pPr>
+      <w:rPr>
+        <w:rFonts w:ascii="Wingdings" w:hAnsi="Wingdings" w:hint="default"/>
+      </w:rPr>
+    </w:lvl>
+  </w:abstractNum>
+  <w:abstractNum w:abstractNumId="2" w15:restartNumberingAfterBreak="0">
     <w:nsid w:val="6C857A6E"/>
     <w:multiLevelType w:val="hybridMultilevel"/>
     <w:tmpl w:val="544EBAB2"/>
@@ -1605,10 +2218,10 @@
       </w:rPr>
     </w:lvl>
   </w:abstractNum>
-  <w:abstractNum w:abstractNumId="2" w15:restartNumberingAfterBreak="0">
+  <w:abstractNum w:abstractNumId="3" w15:restartNumberingAfterBreak="0">
     <w:nsid w:val="70816289"/>
     <w:multiLevelType w:val="hybridMultilevel"/>
-    <w:tmpl w:val="22DCBCA4"/>
+    <w:tmpl w:val="F3E643F4"/>
     <w:lvl w:ilvl="0" w:tplc="0409000D">
       <w:start w:val="1"/>
       <w:numFmt w:val="bullet"/>
@@ -1718,7 +2331,7 @@
       </w:rPr>
     </w:lvl>
   </w:abstractNum>
-  <w:abstractNum w:abstractNumId="3" w15:restartNumberingAfterBreak="0">
+  <w:abstractNum w:abstractNumId="4" w15:restartNumberingAfterBreak="0">
     <w:nsid w:val="765F5C60"/>
     <w:multiLevelType w:val="hybridMultilevel"/>
     <w:tmpl w:val="6AB40500"/>
@@ -1808,16 +2421,19 @@
     </w:lvl>
   </w:abstractNum>
   <w:num w:numId="1" w16cid:durableId="1238395878">
-    <w:abstractNumId w:val="3"/>
+    <w:abstractNumId w:val="4"/>
   </w:num>
   <w:num w:numId="2" w16cid:durableId="127939840">
     <w:abstractNumId w:val="0"/>
   </w:num>
-  <w:num w:numId="3" w16cid:durableId="884368583">
+  <w:num w:numId="3" w16cid:durableId="1827938514">
+    <w:abstractNumId w:val="1"/>
+  </w:num>
+  <w:num w:numId="4" w16cid:durableId="706641418">
     <w:abstractNumId w:val="2"/>
   </w:num>
-  <w:num w:numId="4" w16cid:durableId="706641418">
-    <w:abstractNumId w:val="1"/>
+  <w:num w:numId="5" w16cid:durableId="884368583">
+    <w:abstractNumId w:val="3"/>
   </w:num>
 </w:numbering>
 </file>
@@ -2775,6 +3391,18 @@
       <w:shd w:val="clear" w:color="auto" w:fill="E1DFDD"/>
     </w:rPr>
   </w:style>
+  <w:style w:type="character" w:styleId="FollowedHyperlink">
+    <w:name w:val="FollowedHyperlink"/>
+    <w:basedOn w:val="DefaultParagraphFont"/>
+    <w:uiPriority w:val="99"/>
+    <w:semiHidden/>
+    <w:unhideWhenUsed/>
+    <w:rsid w:val="00650DD6"/>
+    <w:rPr>
+      <w:color w:val="96607D" w:themeColor="followedHyperlink"/>
+      <w:u w:val="single"/>
+    </w:rPr>
+  </w:style>
 </w:styles>
 </file>
 
@@ -3091,4 +3719,253 @@
     </a:ext>
   </a:extLst>
 </a:theme>
+</file>
+
+<file path=customXml/item1.xml><?xml version="1.0" encoding="utf-8"?>
+<ct:contentTypeSchema xmlns:ct="http://schemas.microsoft.com/office/2006/metadata/contentType" xmlns:ma="http://schemas.microsoft.com/office/2006/metadata/properties/metaAttributes" ct:_="" ma:_="" ma:contentTypeName="Document" ma:contentTypeID="0x0101003BC09CA2F460AB45A38B3A9354C98C0F" ma:contentTypeVersion="9" ma:contentTypeDescription="Create a new document." ma:contentTypeScope="" ma:versionID="80d119e6645045ec2a0cf2831f468cf4">
+  <xsd:schema xmlns:xsd="http://www.w3.org/2001/XMLSchema" xmlns:xs="http://www.w3.org/2001/XMLSchema" xmlns:p="http://schemas.microsoft.com/office/2006/metadata/properties" xmlns:ns3="1ca74574-2e77-4b7c-a4d9-851c21a82660" xmlns:ns4="366faa83-77af-4b72-8880-17e456abf2c7" targetNamespace="http://schemas.microsoft.com/office/2006/metadata/properties" ma:root="true" ma:fieldsID="4bb1a85e64f3bf26a2fceda55487d93e" ns3:_="" ns4:_="">
+    <xsd:import namespace="1ca74574-2e77-4b7c-a4d9-851c21a82660"/>
+    <xsd:import namespace="366faa83-77af-4b72-8880-17e456abf2c7"/>
+    <xsd:element name="properties">
+      <xsd:complexType>
+        <xsd:sequence>
+          <xsd:element name="documentManagement">
+            <xsd:complexType>
+              <xsd:all>
+                <xsd:element ref="ns3:MediaServiceMetadata" minOccurs="0"/>
+                <xsd:element ref="ns3:MediaServiceFastMetadata" minOccurs="0"/>
+                <xsd:element ref="ns3:MediaServiceObjectDetectorVersions" minOccurs="0"/>
+                <xsd:element ref="ns3:_activity" minOccurs="0"/>
+                <xsd:element ref="ns4:SharedWithUsers" minOccurs="0"/>
+                <xsd:element ref="ns4:SharedWithDetails" minOccurs="0"/>
+                <xsd:element ref="ns4:SharingHintHash" minOccurs="0"/>
+                <xsd:element ref="ns3:MediaServiceSearchProperties" minOccurs="0"/>
+                <xsd:element ref="ns3:MediaServiceDateTaken" minOccurs="0"/>
+              </xsd:all>
+            </xsd:complexType>
+          </xsd:element>
+        </xsd:sequence>
+      </xsd:complexType>
+    </xsd:element>
+  </xsd:schema>
+  <xsd:schema xmlns:xsd="http://www.w3.org/2001/XMLSchema" xmlns:xs="http://www.w3.org/2001/XMLSchema" xmlns:dms="http://schemas.microsoft.com/office/2006/documentManagement/types" xmlns:pc="http://schemas.microsoft.com/office/infopath/2007/PartnerControls" targetNamespace="1ca74574-2e77-4b7c-a4d9-851c21a82660" elementFormDefault="qualified">
+    <xsd:import namespace="http://schemas.microsoft.com/office/2006/documentManagement/types"/>
+    <xsd:import namespace="http://schemas.microsoft.com/office/infopath/2007/PartnerControls"/>
+    <xsd:element name="MediaServiceMetadata" ma:index="8" nillable="true" ma:displayName="MediaServiceMetadata" ma:hidden="true" ma:internalName="MediaServiceMetadata" ma:readOnly="true">
+      <xsd:simpleType>
+        <xsd:restriction base="dms:Note"/>
+      </xsd:simpleType>
+    </xsd:element>
+    <xsd:element name="MediaServiceFastMetadata" ma:index="9" nillable="true" ma:displayName="MediaServiceFastMetadata" ma:hidden="true" ma:internalName="MediaServiceFastMetadata" ma:readOnly="true">
+      <xsd:simpleType>
+        <xsd:restriction base="dms:Note"/>
+      </xsd:simpleType>
+    </xsd:element>
+    <xsd:element name="MediaServiceObjectDetectorVersions" ma:index="10" nillable="true" ma:displayName="MediaServiceObjectDetectorVersions" ma:hidden="true" ma:indexed="true" ma:internalName="MediaServiceObjectDetectorVersions" ma:readOnly="true">
+      <xsd:simpleType>
+        <xsd:restriction base="dms:Text"/>
+      </xsd:simpleType>
+    </xsd:element>
+    <xsd:element name="_activity" ma:index="11" nillable="true" ma:displayName="_activity" ma:hidden="true" ma:internalName="_activity">
+      <xsd:simpleType>
+        <xsd:restriction base="dms:Note"/>
+      </xsd:simpleType>
+    </xsd:element>
+    <xsd:element name="MediaServiceSearchProperties" ma:index="15" nillable="true" ma:displayName="MediaServiceSearchProperties" ma:hidden="true" ma:internalName="MediaServiceSearchProperties" ma:readOnly="true">
+      <xsd:simpleType>
+        <xsd:restriction base="dms:Note"/>
+      </xsd:simpleType>
+    </xsd:element>
+    <xsd:element name="MediaServiceDateTaken" ma:index="16" nillable="true" ma:displayName="MediaServiceDateTaken" ma:hidden="true" ma:indexed="true" ma:internalName="MediaServiceDateTaken" ma:readOnly="true">
+      <xsd:simpleType>
+        <xsd:restriction base="dms:Text"/>
+      </xsd:simpleType>
+    </xsd:element>
+  </xsd:schema>
+  <xsd:schema xmlns:xsd="http://www.w3.org/2001/XMLSchema" xmlns:xs="http://www.w3.org/2001/XMLSchema" xmlns:dms="http://schemas.microsoft.com/office/2006/documentManagement/types" xmlns:pc="http://schemas.microsoft.com/office/infopath/2007/PartnerControls" targetNamespace="366faa83-77af-4b72-8880-17e456abf2c7" elementFormDefault="qualified">
+    <xsd:import namespace="http://schemas.microsoft.com/office/2006/documentManagement/types"/>
+    <xsd:import namespace="http://schemas.microsoft.com/office/infopath/2007/PartnerControls"/>
+    <xsd:element name="SharedWithUsers" ma:index="12" nillable="true" ma:displayName="Shared With" ma:internalName="SharedWithUsers" ma:readOnly="true">
+      <xsd:complexType>
+        <xsd:complexContent>
+          <xsd:extension base="dms:UserMulti">
+            <xsd:sequence>
+              <xsd:element name="UserInfo" minOccurs="0" maxOccurs="unbounded">
+                <xsd:complexType>
+                  <xsd:sequence>
+                    <xsd:element name="DisplayName" type="xsd:string" minOccurs="0"/>
+                    <xsd:element name="AccountId" type="dms:UserId" minOccurs="0" nillable="true"/>
+                    <xsd:element name="AccountType" type="xsd:string" minOccurs="0"/>
+                  </xsd:sequence>
+                </xsd:complexType>
+              </xsd:element>
+            </xsd:sequence>
+          </xsd:extension>
+        </xsd:complexContent>
+      </xsd:complexType>
+    </xsd:element>
+    <xsd:element name="SharedWithDetails" ma:index="13" nillable="true" ma:displayName="Shared With Details" ma:internalName="SharedWithDetails" ma:readOnly="true">
+      <xsd:simpleType>
+        <xsd:restriction base="dms:Note">
+          <xsd:maxLength value="255"/>
+        </xsd:restriction>
+      </xsd:simpleType>
+    </xsd:element>
+    <xsd:element name="SharingHintHash" ma:index="14" nillable="true" ma:displayName="Sharing Hint Hash" ma:hidden="true" ma:internalName="SharingHintHash" ma:readOnly="true">
+      <xsd:simpleType>
+        <xsd:restriction base="dms:Text"/>
+      </xsd:simpleType>
+    </xsd:element>
+  </xsd:schema>
+  <xsd:schema xmlns="http://schemas.openxmlformats.org/package/2006/metadata/core-properties" xmlns:xsd="http://www.w3.org/2001/XMLSchema" xmlns:xsi="http://www.w3.org/2001/XMLSchema-instance" xmlns:dc="http://purl.org/dc/elements/1.1/" xmlns:dcterms="http://purl.org/dc/terms/" xmlns:odoc="http://schemas.microsoft.com/internal/obd" targetNamespace="http://schemas.openxmlformats.org/package/2006/metadata/core-properties" elementFormDefault="qualified" attributeFormDefault="unqualified" blockDefault="#all">
+    <xsd:import namespace="http://purl.org/dc/elements/1.1/" schemaLocation="http://dublincore.org/schemas/xmls/qdc/2003/04/02/dc.xsd"/>
+    <xsd:import namespace="http://purl.org/dc/terms/" schemaLocation="http://dublincore.org/schemas/xmls/qdc/2003/04/02/dcterms.xsd"/>
+    <xsd:element name="coreProperties" type="CT_coreProperties"/>
+    <xsd:complexType name="CT_coreProperties">
+      <xsd:all>
+        <xsd:element ref="dc:creator" minOccurs="0" maxOccurs="1"/>
+        <xsd:element ref="dcterms:created" minOccurs="0" maxOccurs="1"/>
+        <xsd:element ref="dc:identifier" minOccurs="0" maxOccurs="1"/>
+        <xsd:element name="contentType" minOccurs="0" maxOccurs="1" type="xsd:string" ma:index="0" ma:displayName="Content Type"/>
+        <xsd:element ref="dc:title" minOccurs="0" maxOccurs="1" ma:index="4" ma:displayName="Title"/>
+        <xsd:element ref="dc:subject" minOccurs="0" maxOccurs="1"/>
+        <xsd:element ref="dc:description" minOccurs="0" maxOccurs="1"/>
+        <xsd:element name="keywords" minOccurs="0" maxOccurs="1" type="xsd:string"/>
+        <xsd:element ref="dc:language" minOccurs="0" maxOccurs="1"/>
+        <xsd:element name="category" minOccurs="0" maxOccurs="1" type="xsd:string"/>
+        <xsd:element name="version" minOccurs="0" maxOccurs="1" type="xsd:string"/>
+        <xsd:element name="revision" minOccurs="0" maxOccurs="1" type="xsd:string">
+          <xsd:annotation>
+            <xsd:documentation>
+                        This value indicates the number of saves or revisions. The application is responsible for updating this value after each revision.
+                    </xsd:documentation>
+          </xsd:annotation>
+        </xsd:element>
+        <xsd:element name="lastModifiedBy" minOccurs="0" maxOccurs="1" type="xsd:string"/>
+        <xsd:element ref="dcterms:modified" minOccurs="0" maxOccurs="1"/>
+        <xsd:element name="contentStatus" minOccurs="0" maxOccurs="1" type="xsd:string"/>
+      </xsd:all>
+    </xsd:complexType>
+  </xsd:schema>
+  <xs:schema xmlns:pc="http://schemas.microsoft.com/office/infopath/2007/PartnerControls" xmlns:xs="http://www.w3.org/2001/XMLSchema" targetNamespace="http://schemas.microsoft.com/office/infopath/2007/PartnerControls" elementFormDefault="qualified" attributeFormDefault="unqualified">
+    <xs:element name="Person">
+      <xs:complexType>
+        <xs:sequence>
+          <xs:element ref="pc:DisplayName" minOccurs="0"/>
+          <xs:element ref="pc:AccountId" minOccurs="0"/>
+          <xs:element ref="pc:AccountType" minOccurs="0"/>
+        </xs:sequence>
+      </xs:complexType>
+    </xs:element>
+    <xs:element name="DisplayName" type="xs:string"/>
+    <xs:element name="AccountId" type="xs:string"/>
+    <xs:element name="AccountType" type="xs:string"/>
+    <xs:element name="BDCAssociatedEntity">
+      <xs:complexType>
+        <xs:sequence>
+          <xs:element ref="pc:BDCEntity" minOccurs="0" maxOccurs="unbounded"/>
+        </xs:sequence>
+        <xs:attribute ref="pc:EntityNamespace"/>
+        <xs:attribute ref="pc:EntityName"/>
+        <xs:attribute ref="pc:SystemInstanceName"/>
+        <xs:attribute ref="pc:AssociationName"/>
+      </xs:complexType>
+    </xs:element>
+    <xs:attribute name="EntityNamespace" type="xs:string"/>
+    <xs:attribute name="EntityName" type="xs:string"/>
+    <xs:attribute name="SystemInstanceName" type="xs:string"/>
+    <xs:attribute name="AssociationName" type="xs:string"/>
+    <xs:element name="BDCEntity">
+      <xs:complexType>
+        <xs:sequence>
+          <xs:element ref="pc:EntityDisplayName" minOccurs="0"/>
+          <xs:element ref="pc:EntityInstanceReference" minOccurs="0"/>
+          <xs:element ref="pc:EntityId1" minOccurs="0"/>
+          <xs:element ref="pc:EntityId2" minOccurs="0"/>
+          <xs:element ref="pc:EntityId3" minOccurs="0"/>
+          <xs:element ref="pc:EntityId4" minOccurs="0"/>
+          <xs:element ref="pc:EntityId5" minOccurs="0"/>
+        </xs:sequence>
+      </xs:complexType>
+    </xs:element>
+    <xs:element name="EntityDisplayName" type="xs:string"/>
+    <xs:element name="EntityInstanceReference" type="xs:string"/>
+    <xs:element name="EntityId1" type="xs:string"/>
+    <xs:element name="EntityId2" type="xs:string"/>
+    <xs:element name="EntityId3" type="xs:string"/>
+    <xs:element name="EntityId4" type="xs:string"/>
+    <xs:element name="EntityId5" type="xs:string"/>
+    <xs:element name="Terms">
+      <xs:complexType>
+        <xs:sequence>
+          <xs:element ref="pc:TermInfo" minOccurs="0" maxOccurs="unbounded"/>
+        </xs:sequence>
+      </xs:complexType>
+    </xs:element>
+    <xs:element name="TermInfo">
+      <xs:complexType>
+        <xs:sequence>
+          <xs:element ref="pc:TermName" minOccurs="0"/>
+          <xs:element ref="pc:TermId" minOccurs="0"/>
+        </xs:sequence>
+      </xs:complexType>
+    </xs:element>
+    <xs:element name="TermName" type="xs:string"/>
+    <xs:element name="TermId" type="xs:string"/>
+  </xs:schema>
+</ct:contentTypeSchema>
+</file>
+
+<file path=customXml/item2.xml><?xml version="1.0" encoding="utf-8"?>
+<p:properties xmlns:p="http://schemas.microsoft.com/office/2006/metadata/properties" xmlns:xsi="http://www.w3.org/2001/XMLSchema-instance" xmlns:pc="http://schemas.microsoft.com/office/infopath/2007/PartnerControls">
+  <documentManagement>
+    <_activity xmlns="1ca74574-2e77-4b7c-a4d9-851c21a82660" xsi:nil="true"/>
+  </documentManagement>
+</p:properties>
+</file>
+
+<file path=customXml/item3.xml><?xml version="1.0" encoding="utf-8"?>
+<?mso-contentType ?>
+<FormTemplates xmlns="http://schemas.microsoft.com/sharepoint/v3/contenttype/forms">
+  <Display>DocumentLibraryForm</Display>
+  <Edit>DocumentLibraryForm</Edit>
+  <New>DocumentLibraryForm</New>
+</FormTemplates>
+</file>
+
+<file path=customXml/itemProps1.xml><?xml version="1.0" encoding="utf-8"?>
+<ds:datastoreItem xmlns:ds="http://schemas.openxmlformats.org/officeDocument/2006/customXml" ds:itemID="{AE7599E9-7D74-46F3-92AC-3CC375FFBB31}">
+  <ds:schemaRefs>
+    <ds:schemaRef ds:uri="http://schemas.microsoft.com/office/2006/metadata/contentType"/>
+    <ds:schemaRef ds:uri="http://schemas.microsoft.com/office/2006/metadata/properties/metaAttributes"/>
+    <ds:schemaRef ds:uri="http://www.w3.org/2001/XMLSchema"/>
+    <ds:schemaRef ds:uri="http://schemas.microsoft.com/office/2006/metadata/properties"/>
+    <ds:schemaRef ds:uri="1ca74574-2e77-4b7c-a4d9-851c21a82660"/>
+    <ds:schemaRef ds:uri="366faa83-77af-4b72-8880-17e456abf2c7"/>
+    <ds:schemaRef ds:uri="http://schemas.microsoft.com/office/2006/documentManagement/types"/>
+    <ds:schemaRef ds:uri="http://schemas.microsoft.com/office/infopath/2007/PartnerControls"/>
+    <ds:schemaRef ds:uri="http://schemas.openxmlformats.org/package/2006/metadata/core-properties"/>
+    <ds:schemaRef ds:uri="http://purl.org/dc/elements/1.1/"/>
+    <ds:schemaRef ds:uri="http://purl.org/dc/terms/"/>
+    <ds:schemaRef ds:uri="http://schemas.microsoft.com/internal/obd"/>
+  </ds:schemaRefs>
+</ds:datastoreItem>
+</file>
+
+<file path=customXml/itemProps2.xml><?xml version="1.0" encoding="utf-8"?>
+<ds:datastoreItem xmlns:ds="http://schemas.openxmlformats.org/officeDocument/2006/customXml" ds:itemID="{421396C8-74B5-43CE-844D-4576CC521786}">
+  <ds:schemaRefs>
+    <ds:schemaRef ds:uri="http://schemas.microsoft.com/office/2006/metadata/properties"/>
+    <ds:schemaRef ds:uri="http://schemas.microsoft.com/office/infopath/2007/PartnerControls"/>
+    <ds:schemaRef ds:uri="1ca74574-2e77-4b7c-a4d9-851c21a82660"/>
+  </ds:schemaRefs>
+</ds:datastoreItem>
+</file>
+
+<file path=customXml/itemProps3.xml><?xml version="1.0" encoding="utf-8"?>
+<ds:datastoreItem xmlns:ds="http://schemas.openxmlformats.org/officeDocument/2006/customXml" ds:itemID="{EB5A5EEE-A6CF-4732-8EB9-050783603260}">
+  <ds:schemaRefs>
+    <ds:schemaRef ds:uri="http://schemas.microsoft.com/sharepoint/v3/contenttype/forms"/>
+  </ds:schemaRefs>
+</ds:datastoreItem>
 </file>
</xml_diff>